<commit_message>
Align manuscript content with advisor comments
Co-authored-by: C20-end <C20-end@users.noreply.github.com>
</commit_message>
<xml_diff>
--- a/生成式人工智能医疗服务中的公众认知配置与人机治理——一项基于社交媒体文本挖掘的分析.docx
+++ b/生成式人工智能医疗服务中的公众认知配置与人机治理——一项基于社交媒体文本挖掘的分析.docx
@@ -69,7 +69,7 @@
           <w:sz w:val="21"/>
           <w:szCs w:val="21"/>
         </w:rPr>
-        <w:t>生成式人工智能进入问诊、报告解读和临床辅助后，医疗机构面对的并不只是公众接不接受，而是公众如何配置系统能力、医生角色、风险与人机关系，并据此影响服务分层、信息披露和问责安排。既有研究多用问卷或情景实验测量接受意愿，社交媒体研究则多止于情感倾向或主题类别，难以说明同一态度内部的认知差异。本文回溯采集微博、抖音、小红书和知乎中围绕AI医生、AI问诊及医疗大模型的中文评论，经数据清洗、相关性识别和态度分类，获得相关评论103,731条，其中71,886条具有明确态度。在有态度文本中构建评论内词共现网络，以Louvain识别的14个词簇为分析单位，从AI能力、医生角色、风险认知和人机关系四个维度进行编码。结果显示，积极评论占相关评论的52.4%，占有态度评论的75.6%；上述数字描述的是评论态度分布，不是人群占比。积极态度内部呈现技术崇拜、务实认可和人机协同等不同配置，中立态度主要体现人机协同，消极态度则表现为技术恐惧和风险责任两类配置。研究将公众态度分析由评价效价推进至多维认知配置，表明过半积极评价并不等于授权AI独立诊断，误诊问责也不等于拒绝使用。医疗服务管理宜按模式区分功能分层、能力边界说明、医生复核和责任接口，而不是依据总体好评率推定临床信任已经形成。</w:t>
+        <w:t>随着生成式人工智能逐步进入问诊、报告解读和临床辅助等医疗场景，公众认知已不仅表现为接受或拒绝，还涉及对系统能力、医生角色、应用风险和人机关系的组合判断。既有研究多采用问卷或情景实验测量接受意愿，社交媒体研究则主要关注情感倾向或主题类别，尚难揭示同一态度内部的认知差异。本研究旨在识别生成式人工智能医疗服务相关公共话语中的认知配置，并分析其人机治理含义。本文回溯采集微博、抖音、小红书和知乎中围绕AI医生、AI问诊及医疗大模型的中文评论，经数据清洗、相关性识别和态度分类，获得相关评论103,731条，其中71,886条具有明确态度。在有态度文本中构建评论内词共现网络，以Louvain算法识别的14个词簇为分析单位，从AI能力、医生角色、风险认知和人机关系四个维度进行编码。结果显示，积极评论占相关评论的52.4%，占有态度评论的75.6%；上述比例反映评论的态度分布，而非人群比例。积极态度内部呈现技术崇拜、务实认可和人机协同等不同配置，中立态度主要体现人机协同，消极态度则表现为技术恐惧和风险责任两类配置。研究将公众态度分析由评价效价推进至多维认知配置，表明积极评价并不等同于认可AI独立诊断，风险问责也不必然意味着拒绝技术。研究结果可为医疗机构完善服务分层、能力边界披露、医生复核和责任接口提供参考。</w:t>
       </w:r>
     </w:p>
     <w:p>
@@ -95,7 +95,7 @@
           <w:sz w:val="21"/>
           <w:szCs w:val="21"/>
         </w:rPr>
-        <w:t>生成式人工智能；医疗服务管理；认知模式；人机协作；技术治理；社交媒体；词共现网络</w:t>
+        <w:t>生成式人工智能；医疗服务管理；认知配置；人机协作；技术治理；社交媒体；词共现网络</w:t>
       </w:r>
     </w:p>
     <w:p>
@@ -156,7 +156,7 @@
           <w:sz w:val="21"/>
           <w:szCs w:val="21"/>
         </w:rPr>
-        <w:t>Once generative AI enters consultation, report interpretation, and clinical support, healthcare organizations face more than a question of public acceptance. The issue is how the public configures system capability, the physician’s role, risk, and human–AI relations, which in turn shapes service stratification, disclosure, and accountability. Existing studies have largely measured acceptance through surveys or scenario experiments, while social media research has mainly examined sentiment or topic categories, leaving variation within the same attitude insufficiently explained. This study retrospectively collected Chinese comments concerning AI doctors, AI consultation, and medical large language models from Weibo, Douyin, Xiaohongshu, and Zhihu. After data cleaning, relevance identification, and attitude classification, 103,731 relevant comments were retained, of which 71,886 expressed an explicit attitude. Within-comment word co-occurrence networks were constructed for attitude-bearing texts. Fourteen Louvain clusters were then coded along four dimensions: AI capability, physician role, risk perception, and the human–AI relationship. Positive comments accounted for 52.4% of all relevant comments and 75.6% of attitude-bearing comments; these figures describe the distribution of comments, not of people. Positive attitudes comprised distinct configurations of technological worship, pragmatic acceptance, and human–AI collaboration; neutral attitudes mainly reflected collaboration, whereas negative attitudes comprised technological fear and risk-accountability. The study shows that a majority-positive evaluation does not authorize independent AI diagnosis, and that accountability concerns do not imply rejection of use. Service management should therefore differentiate functional stratification, capability-boundary disclosure, physician review, and accountability interfaces by cognitive pattern, rather than inferring clinical trust from overall approval rates.</w:t>
+        <w:t>As generative artificial intelligence (AI) is increasingly used in medical consultation, report interpretation, and clinical support, public cognition extends beyond acceptance or rejection to configurations of perceived system capability, physician roles, application risks, and human–AI relationships. Existing studies have largely measured acceptance through surveys or scenario experiments, while social media research has mainly examined sentiment or topic categories, leaving differences within the same attitude insufficiently explained. This study aimed to identify cognitive configurations in public discourse concerning generative AI healthcare services and examine their implications for human–AI governance. Chinese comments concerning AI doctors, AI consultation, and medical large language models were retrospectively collected from Weibo, Douyin, Xiaohongshu, and Zhihu. After data cleaning, relevance identification, and attitude classification, 103,731 relevant comments were retained, of which 71,886 expressed an explicit attitude. Within-comment word co-occurrence networks were constructed for attitude-bearing texts, and 14 clusters identified by the Louvain algorithm were coded along four dimensions: AI capability, physician role, risk perception, and the human–AI relationship. Positive comments accounted for 52.4% of all relevant comments and 75.6% of attitude-bearing comments; these percentages describe the distribution of comments rather than people. Positive attitudes comprised technological worship, pragmatic acceptance, and human–AI collaboration; neutral attitudes mainly reflected collaboration, whereas negative attitudes comprised technological fear and risk-accountability. By extending attitude analysis from evaluative valence to multidimensional cognitive configurations, the findings show that positive evaluations do not amount to authorization of independent AI diagnosis and that accountability concerns do not necessarily imply rejection of the technology. The results provide evidence for improving service stratification, capability-boundary disclosure, physician review, and accountability interfaces in healthcare organizations.</w:t>
       </w:r>
     </w:p>
     <w:p>
@@ -182,7 +182,7 @@
           <w:sz w:val="21"/>
           <w:szCs w:val="21"/>
         </w:rPr>
-        <w:t>generative artificial intelligence; healthcare service management; cognitive pattern; human–AI collaboration; technology governance; social media; word co-occurrence network</w:t>
+        <w:t>generative artificial intelligence; healthcare service management; cognitive configuration; human–AI collaboration; technology governance; social media; word co-occurrence network</w:t>
       </w:r>
     </w:p>
     <w:p>
@@ -243,7 +243,7 @@
           <w:sz w:val="21"/>
           <w:szCs w:val="21"/>
         </w:rPr>
-        <w:t>我国相关政策正在形成一般性规范与专项推动并行的制度环境。2025年，国务院《关于深入实施“人工智能+”行动的意见》提出推广高水平居民健康助手，有序推动人工智能在辅助诊疗、健康管理和医保服务等场景的应用〔23〕；五部门随后印发的《关于促进和规范“人工智能+医疗卫生”应用发展的实施意见》，将基层诊疗辅助、临床专病决策和患者就诊服务列为重点方向，同时强调审核评估、风险预警、数据安全和隐私保护〔24〕。2023年以来的生成式人工智能服务监管，以及卫生健康行业人工智能应用场景指引，共同构成有序应用、辅助定位与安全治理的制度背景，并不意味着认可人工智能独立实施诊疗。</w:t>
+        <w:t>我国相关政策正在形成一般性规范与专项推动并行的制度环境。2025年，国务院《关于深入实施“人工智能+”行动的意见》提出推广高水平居民健康助手，有序推动人工智能在辅助诊疗、健康管理和医保服务等场景的应用〔23〕；五部门随后印发的《关于促进和规范“人工智能+医疗卫生”应用发展的实施意见》，将基层诊疗辅助、临床专病决策和患者就诊服务列为重点方向，同时强调审核评估、风险预警、数据安全和隐私保护〔24〕。这些政策为生成式人工智能进入医疗场景提供了制度基础，但其重点在于有序应用、辅助定位与安全治理，并不意味着认可人工智能独立实施诊疗。</w:t>
       </w:r>
     </w:p>
     <w:p>
@@ -285,7 +285,7 @@
           <w:sz w:val="21"/>
           <w:szCs w:val="21"/>
         </w:rPr>
-        <w:t>基于此，本文以微博、抖音、小红书和知乎中围绕AI医生、AI问诊、医疗大模型及相邻智能医疗服务的自然生成评论为研究材料，按照“态度识别—认知主题提取—认知结构分析—认知模式识别”的路径展开分析。研究先识别评论的相关性和态度类别，再结合高频词、TF-IDF和评论内词共现网络提取不同态度群体的认知词簇，最后以技术接受、算法欣赏与算法厌恶以及人机互补理论为解释依据，从AI能力、医生角色、风险认知和人机关系四个维度进行编码并归纳典型认知模式。本文将医疗服务中的公众认知由接受或拒绝推进至能力、角色、风险和关系的配置结构，用以说明同一态度内部的服务授权含义并不相同；同时以多平台自然评论补充问卷和情景实验受预设选项限制的不足，并以词簇而非单条评论为分析单位识别五种典型模式。在此基础上，把五种模式对应到服务分层、能力披露和问责接口，以便医疗机构区分功能便利与临床信任、使用回避与责任诉求。本文描述的是特定检索条件下的公共话语结构，不将社交媒体评论直接等同于全体公众或患者的实际采纳行为。</w:t>
+        <w:t>基于此，本文以微博、抖音、小红书和知乎中围绕AI医生、AI问诊、医疗大模型及相邻智能医疗服务的自然生成评论为研究材料，按照“态度识别—认知主题提取—认知结构分析—认知模式识别”的路径展开分析。研究首先识别相关评论及其态度类型，继而比较不同态度群体的认知主题与话语结构，最后结合技术接受、算法欣赏、算法厌恶和人机互补理论，从AI能力、医生角色、风险认知和人机关系四个维度归纳典型认知配置。本文的贡献主要体现在三个方面：第一，将公众认知研究由积极、中立和消极的态度效价推进至多维认知配置，以揭示同一态度内部不同的服务授权含义；第二，利用多平台自然生成评论，补充问卷和情景实验受预设选项限制的不足；第三，将认知配置与服务分层、能力披露和责任接口相联系，为区分功能便利与临床信任、使用回避与责任诉求提供分析依据。本文描述的是特定检索条件下的公共话语结构，不将社交媒体评论直接等同于全体公众或患者的实际采纳行为。</w:t>
       </w:r>
     </w:p>
     <w:p>
@@ -338,7 +338,7 @@
           <w:sz w:val="21"/>
           <w:szCs w:val="21"/>
         </w:rPr>
-        <w:t>技术接受研究通常把感知有用性和易用性当作使用意愿的前因〔25〕。生成式人工智能一旦进入诊疗沟通，这一还原就不够用。医疗决策出错的后果难以事后补救，公众要判断的不只是好不好用，还包括系统能否单独下诊断、医生是否仍在场、出事之后责任落在谁身上。现有实验已经把这几件事拆开测量：提高诊断透明度和论证质量，可以通过专业性感知和认知信任拉动独立诊断采纳〔1〕；系统表现达到或超过专科水平，对就诊选择的拉动也最大〔2〕。信息质量和性能确实能改变选择，但选择概率上升并不等于独立诊断权已经交给系统。同一实验里，医生在场和治理认证仍会改写选择结果〔2〕。</w:t>
+        <w:t>技术接受研究通常将感知有用性和感知易用性视为使用意愿的重要前因〔25〕。然而，将公众对生成式人工智能医疗应用的接受仅还原为效用判断，难以反映医疗决策的特殊性。由于诊疗错误可能产生较高后果，公众还会同时考虑系统能否独立作出诊断、医生是否参与以及不良后果由谁承担。Liu等的情景实验表明，提高诊断透明度和论证质量，可以通过感知专业性与认知信任增强公众对AI独立诊断的采纳意愿〔1〕。Bracic等进一步发现，系统性能是影响就诊选择的重要属性，而医生在场和治理认证同样能够提高选择概率〔2〕。这些研究共同说明，信息质量和系统性能能够促进技术采纳，但采纳意愿的提高并不等同于公众认可AI脱离医生监督独立实施诊疗。</w:t>
       </w:r>
     </w:p>
     <w:p>
@@ -355,7 +355,7 @@
           <w:sz w:val="21"/>
           <w:szCs w:val="21"/>
         </w:rPr>
-        <w:t>人工智能参与本身往往也不是一条中性信息。建议内容相同，一旦标明由AI生成或由医生与AI共同生成，可靠性和遵从意愿仍会下降〔4〕；医生简介中出现AI辅助诊断，信任和求助意愿同样会降低〔5〕。与执业护士健康建议相比，人类来源仍被评为更可信〔21〕；门户消息即便写得更让人满意，标明AI撰写后评价也会回落〔20〕。调查与实验指向同一点：总体态度可以偏积极，决策权却仍被交给医生，并且要求系统可解释〔6-8,17〕。功能层面的信任更靠近人类医生；解释能够改善评价，却不足以让AI单独问诊成为更可接受的方案〔3〕。对医生和卫生系统的信任，比抽象的技术乐观更能预测人们对医疗AI的期待〔9〕；约六成受访者还要求被告知诊疗中使用了人工智能〔10〕。这些研究已经足以说明，公众接受是有条件的。它们给出的仍是分项得分和选择概率，看不到能力判断、医生角色、风险和人机关系在不受选项约束时怎样写进同一条评论。</w:t>
+        <w:t>除系统性能与信息质量外，人工智能身份披露和医生参与方式也会影响公众评价。在建议内容相同的情况下，将建议标注为由AI生成或由医生与AI共同生成，可能降低公众对其可靠性和遵从意愿的评价〔4〕；医生简介中出现AI辅助诊断信息，也可能降低患者信任和求助意愿〔5〕。与执业护士提供的健康建议相比，公众仍对人类来源表现出更高信任〔21〕；即使AI起草的患者门户消息在内容评价上较高，披露AI来源后满意度仍可能下降〔20〕。调查与实验研究总体表明，公众可以对医疗AI持积极态度，但仍倾向于保留医生的决策主导权，并要求系统具有可解释性〔6-8,17〕。诊断解释虽然能够改善评价，却不足以使AI独立问诊成为更可接受的方案〔3〕。此外，对医生和卫生系统的信任比一般技术乐观更能预测公众对医疗AI的期待〔9〕，相当比例的受访者要求获知诊疗过程中是否使用人工智能〔10〕。由此可见，公众接受具有明显的条件性；但现有研究主要提供分项得分或选择概率，仍难揭示不同判断在自然话语中如何共同出现。</w:t>
       </w:r>
     </w:p>
     <w:p>
@@ -372,7 +372,7 @@
           <w:sz w:val="21"/>
           <w:szCs w:val="21"/>
         </w:rPr>
-        <w:t>社交媒体评论少受预设构念约束，更适合观察这些判断是否同时出现。已有抓取却多在情感极性或主题类别处停住。Gao等对2017年微博医疗人工智能讨论的分析显示，有态度文本以积极为主，其间夹杂技术收益、社会风险和能否取代医生〔11〕。语料形成于大语言模型进入日常医疗咨询之前，极性分类也写不出替代想象、功能认可和风险担忧如何捆在一起，因而不能直接外推到生成式应用。</w:t>
+        <w:t>相较于预设构念的问卷与实验，社交媒体评论能够呈现评论者自主组织的表达，因而更适合观察系统能力、医生角色和风险判断如何共同进入公共话语。然而，已有社交媒体研究多以情感极性或主题类别作为分析终点。Gao等对2017年微博医疗人工智能讨论的分析显示，有明确态度的文本以积极评价为主，同时涉及技术收益、社会风险以及AI能否取代医生等议题〔11〕。由于该语料形成于大语言模型广泛进入日常医疗咨询之前，其结论不能直接外推至生成式人工智能医疗应用；同时，单一极性分类也难以说明功能认可、替代想象和风险担忧之间的组合关系。</w:t>
       </w:r>
     </w:p>
     <w:p>
@@ -389,7 +389,7 @@
           <w:sz w:val="21"/>
           <w:szCs w:val="21"/>
         </w:rPr>
-        <w:t>生成式模型进入日常讨论之后，观察窗口前移了，分析终点变化不大。中国公众对ChatGPT的讨论仍被收成技术效能、工作与教育影响，以及虚假信息、就业替代和人机关系等议题〔12〕；健康AI在X平台上的讨论以积极情感为主，隐私与人机对齐则集中触发担忧〔13〕。接触ChatGPT之后，态度原本不确定的人更可能转而认为医疗AI有益，已经形成明确态度的人却并不因此改口〔19〕。主题清单和总体情感回答的是在谈什么、站在哪一边。效能认可和人机关系关切都可以表现为积极或消极，但对独立诊断的授权程度并不相同；消极表达既可能是不敢使用，也可能是在追问误诊责任。要把生成式医疗应用的公众认知写成可对照的结构，需要在效价之外比较同一态度内部的能力判断、医生角色、风险认知和人机关系如何组合。</w:t>
+        <w:t>生成式模型进入日常应用后，相关研究的观察对象有所扩展，但多数研究仍主要关注总体情感与议题分布。基于中国社交媒体的研究将公众对ChatGPT的讨论概括为技术效能、工作与教育影响，以及虚假信息、就业替代和人机关系等议题〔12〕；X平台上的健康AI讨论总体呈现积极情感，而隐私和人机对齐问题更容易引发担忧〔13〕。接触ChatGPT可能使原本态度不确定者更倾向于认可医疗AI的潜在收益，但对已经形成明确态度者的影响相对有限〔19〕。这些研究揭示了公众讨论的主要内容及评价方向，却尚未充分解释相同态度内部的认知差异。对技术效能的肯定可能对应独立诊疗能力信赖，也可能仅表示对功能便利性的认可；消极表达则可能分别源于使用回避、替代焦虑或误诊责任追问。因此，有必要在态度效价之外，比较AI能力、医生角色、风险认知和人机关系的组合方式。</w:t>
       </w:r>
     </w:p>
     <w:p>
@@ -424,7 +424,7 @@
           <w:sz w:val="21"/>
           <w:szCs w:val="21"/>
         </w:rPr>
-        <w:t>算法建议上的依赖并不稳定，因而同一条积极或消极评论，背后的机制可以完全不同。人们在见到算法出错后可能转而回避算法，即使算法总体上仍优于人类判断〔30〕。生成式医疗应用把这一张力表现得更尖锐：流畅、确定的语言输出容易被读成专业性，幻觉和误诊的后果又足以迅速抽走依赖。公众抗拒医疗AI，既因为算法被看成黑箱，也因为人们自以为更懂医生如何决策〔18〕。临床场景里还有另一种错位：高专长医生会对标明来自AI的建议给出更低的质量分，但不准确建议仍然会拉低诊断准确性，无论它被标记为人类还是AI〔14〕。口头贬损因此不能直接当成行为上的完全拒斥。功能评价提高并不等于接受替代医生〔1,3〕，标明AI来源还会额外拉低评价〔4,5〕，说明欣赏和厌恶都不是简单的正负态度。已有社交媒体研究报出的积极倾向或效能讨论〔11-13〕仍停在效价和主题层，区分不出积极评价究竟是能力信赖、使用便利还是协作期待，也区分不出消极评价究竟是能力怀疑、替代焦虑还是责任诉求。后文据此在同一极性内部识别不同配置。</w:t>
+        <w:t>算法欣赏与算法厌恶为解释同一态度内部的差异化判断提供了理论视角。算法厌恶表现为个体在观察到算法错误后降低对其依赖，即使算法总体表现仍优于人类判断〔30〕；算法欣赏则体现为在特定任务中更愿意采用算法建议。生成式人工智能以流畅且具有确定性的语言生成回答，可能提高公众对其专业性的判断，而模型幻觉和误诊后果又可能显著降低依赖。公众对医疗AI的抗拒既可能源于算法黑箱，也可能源于对医生决策过程的主观熟悉感〔18〕。临床研究还发现，高专长医生会对标注为AI来源的建议给出更低质量评价，但不准确建议无论被标注为人类还是AI来源，均可能降低诊断准确性〔14〕，说明表达出的负面评价并不必然对应行为上的完全拒绝。由此，算法欣赏不能直接等同于积极态度，算法厌恶也不能简单等同于消极态度。现有社交媒体研究报告的积极倾向或技术效能议题〔11-13〕，仍不足以区分积极评价源于能力信赖、功能便利还是协作期待，也难以区分消极评价源于能力怀疑、替代焦虑还是责任诉求。</w:t>
       </w:r>
     </w:p>
     <w:p>
@@ -459,7 +459,7 @@
           <w:sz w:val="21"/>
           <w:szCs w:val="21"/>
         </w:rPr>
-        <w:t>如果欣赏不等于授权、厌恶不等于弃用，就需要一个尺度来判断什么样的人机关系说得通。人机互补把这个问题写成分工而不是替代：人工智能的价值不必以取代人类为前提，而在于按双方能力边界分配任务，使组合绩效高于任一主体单独行动〔15〕。生成式模型长于检索、文本生成、模式归纳和高频交互；情境化临床判断、身体检查、价值权衡、同理沟通和最终责任仍在医生一侧。已部署临床机器学习系统的使用者，也更常把系统当成协作对象而不是替代判断〔16〕。本文所称理性认知，不是给评论者做价值分级，而是看话语里的能力、边界、风险和责任是否相互匹配。把流畅表达直接写成独立诊疗，或因潜在错误而否定全部辅助，都偏离这一尺度；把技术放进有适用范围、医生监督和可追溯责任的协作结构里，才与人机互补的要求一致。</w:t>
+        <w:t>由于算法欣赏不等同于授权AI独立诊疗，算法厌恶也不意味着拒绝一切辅助应用，因此还需要从人机关系层面判断公众认知是否与技术能力边界相匹配。人机互补理论强调，人工智能价值的实现并不以完全替代人类为前提，而在于根据双方能力边界进行任务分工，使组合绩效超过任一主体单独行动〔15〕。生成式模型在信息检索、文本生成、模式归纳和高频交互方面具有优势，医生则承担情境化临床判断、身体检查、价值权衡、同理沟通和最终责任。已部署临床机器学习系统的使用者也更倾向于将系统视为协作对象，而非人类判断的替代者〔16〕。本文所称理性认知并非对评论者进行价值分级，而是指对系统能力、适用边界、潜在风险和责任机制形成相互匹配的判断。将流畅表达直接理解为独立诊疗能力，或因潜在错误而否定全部辅助价值，均不符合这一要求；更为适当的认知是将技术置于具有明确适用范围、医生监督和可追溯责任的协作结构之中。</w:t>
       </w:r>
     </w:p>
     <w:p>
@@ -476,7 +476,7 @@
           <w:sz w:val="21"/>
           <w:szCs w:val="21"/>
         </w:rPr>
-        <w:t>实验把有用性、医生在场、来源标签和知情要求分开测量，评论却可能把它们写在同一句里。为把这两种材料接到同一套类目上，本文用四个不可互相替代的维度刻画认知配置：系统被写成能够独立诊疗、有限度辅助还是基本不可用；医生被弱化、被明确为把关者还是被强化为唯一可信主体；误诊、幻觉、监管和责任在话语中被忽视、被正视还是被夸大；AI与医生被理解为替代、协同还是排斥。后续编码按这四维操作；五种模式在词簇编码完成后再归纳，不在研究开始前预设。</w:t>
+        <w:t>既有实验通常分别测量有用性、医生参与、来源标注和知情要求，而社交媒体评论可能在同一表达中同时呈现这些判断。为连接结构化测量与自然话语，本文从四个相互关联但不可替代的维度刻画认知配置：第一，AI能力认知，关注系统被理解为能够独立诊疗、有限度辅助还是基本不可用；第二，医生角色认知，关注医生被弱化、被明确为把关者还是被强化为唯一可信主体；第三，风险认知，关注误诊、幻觉、监管和责任在话语中被忽视、被正视还是被夸大；第四，人机关系认知，关注AI与医生被理解为替代、协同还是排斥关系。后续分析依据上述四个维度开展编码，五种认知模式则在词簇编码完成后归纳形成，而非在研究开始前预设。</w:t>
       </w:r>
     </w:p>
     <w:p>
@@ -528,7 +528,7 @@
           <w:sz w:val="21"/>
           <w:szCs w:val="21"/>
         </w:rPr>
-        <w:t xml:space="preserve">本研究以微博、抖音、小红书和知乎中关于AI医生、AI问诊及医疗大模型等应用的自然生成评论为材料，按照“态度识别—认知主题提取—认知结构分析—认知模式识别”的路径展开。首先对文本进行清洗，并依次完成相关性识别和态度分类；其次在有明确态度的评论中提取高频词与TF-IDF特征，构建评论内词共现网络并识别认知词簇；最后结合算法欣赏、算法厌恶和人机互补理论，从四个维度对词簇进行编码并归纳典型认知模式。研究流程见图1。</w:t>
+        <w:t>本研究基于微博、抖音、小红书和知乎中关于AI医生、AI问诊及医疗大模型等应用的自然生成评论，采用“态度识别—认知主题提取—认知结构分析—认知模式识别”的递进式研究框架。首先，获取并清洗多平台评论，以形成用于分析的公共话语语料；其次，通过相关性识别和态度分类，区分无态度、积极、中立和消极评论；再次，在有明确态度的评论中提取高频词和TF-IDF特征，构建评论内词共现网络，并通过Louvain算法识别认知词簇；最后，结合算法欣赏、算法厌恶和人机互补理论，从AI能力、医生角色、风险认知和人机关系四个维度对词簇进行编码，进而归纳典型认知模式。整体研究流程见图1。</w:t>
       </w:r>
     </w:p>
     <w:p>
@@ -16389,7 +16389,7 @@
           <w:sz w:val="21"/>
           <w:szCs w:val="21"/>
         </w:rPr>
-        <w:t>本文将医疗服务中的公众态度问题从接受或拒绝推进到角色配置。相同效价可以由不同的能力、医生角色、风险和关系判断构成，因而好评率不能直接当作独立诊断授权，差评也不能直接当作拒绝辅助。算法欣赏与算法厌恶〔30〕并不与正负态度一一对应：积极评价可能是能力信赖、功能认可或协作期待，消极表达可能是能力怀疑、替代焦虑或制度性问责。人机互补〔15〕用来区分协同、替代和排斥，把话语模式连接到可设计的服务角色，而不是只讨论如何做技术宣传。</w:t>
+        <w:t>本文的理论贡献主要体现在三个方面。第一，研究将公众对生成式人工智能医疗服务的评价由接受或拒绝的单一效价推进至多维认知配置，说明相同态度可能由不同的能力判断、医生角色、风险认知和人机关系共同构成。第二，研究表明算法欣赏与算法厌恶〔30〕并不与正负态度形成一一对应关系：积极评价可能源于独立能力信赖、功能认可或协作期待，消极表达也可能源于能力怀疑、替代焦虑或制度性问责。第三，研究引入人机互补理论〔15〕区分协同、替代和排斥关系，将社交媒体话语中的认知差异与医疗服务中的角色配置相联系。由此，本文不仅识别公众讨论的评价方向，也进一步解释不同评价所包含的服务授权与治理含义。</w:t>
       </w:r>
     </w:p>
     <w:p>
@@ -16406,7 +16406,7 @@
           <w:sz w:val="21"/>
           <w:szCs w:val="21"/>
         </w:rPr>
-        <w:t>管理上需要按模式安排服务，而不是按总体态度做同一套宣传。务实认可型主要认可购药、导诊和信息查询，应与诊断决策分层提供，避免同一套“智能问诊”包装。技术崇拜型把流畅交互外推为独立诊疗，应在问诊和报告解读入口写明能力边界、错误可能和医生复核。人机协同型接受辅助，但风险讨论不足，宜把医生把关写成默认流程，并补充适用病情与责任说明。技术恐惧型叠加能力怀疑和替代焦虑，宜用具体任务说明系统能做与不能做的，而不是笼统保证技术安全。风险责任型追问误诊后的主体和救济，应公开审核、责任人、异议渠道和损害救济，并告知何时使用了AI〔10,20〕。五种模式对应的服务治理安排见表11。Nong和Ji的调查也提示，若沟通不能兑现对医患关系和可及性的期待，可能进一步消耗既有信任〔9〕。</w:t>
+        <w:t>上述认知模式为医疗服务治理提供了差异化的问题线索，但并不意味着可以据此识别并分类管理具体用户。务实认可型主要关注购药、导诊和信息查询的便利性，提示医疗机构应区分低风险信息服务与诊断决策，避免以统一的“智能问诊”概念模糊不同功能。技术崇拜型将流畅交互外推为独立诊疗能力，因此有必要在问诊和报告解读入口明确说明能力边界、错误可能和医生复核机制。人机协同型认可技术的辅助价值，但对风险和责任讨论相对不足，宜将医生把关设置为基本流程，并说明适用病情与责任边界。针对技术恐惧型所包含的能力怀疑和替代焦虑，应依据具体任务说明系统能够完成和不能完成的事项，避免笼统强调技术安全。风险责任型则提示机构公开审核环节、责任主体、异议渠道和损害救济，并告知患者何时使用了人工智能〔10,20〕。五种模式的服务治理含义见表11。Nong和Ji的研究亦表明，如果技术应用未能兑现公众对医患关系和服务可及性的期待，可能进一步削弱既有信任〔9〕。</w:t>
       </w:r>
     </w:p>
     <w:p>
@@ -17056,7 +17056,7 @@
           <w:sz w:val="21"/>
           <w:szCs w:val="21"/>
         </w:rPr>
-        <w:t>本文基于多平台社交媒体评论，构建了由态度效价、认知主题、词语共现结构到认知配置的分析链条。模型识别结果显示，积极评论占相关评论的52.4%，占有态度评论的75.6%。上述比例均指评论态度分布，不是人群占比。进一步分析表明，积极态度内部呈现技术崇拜、务实认可和人机协同等不同配置，中立态度主要体现人机协同，消极态度则表现为技术恐惧和风险责任两类配置；五种模式以词簇为单位，簇数不能写成人群比例。因此，公众对生成式人工智能医疗应用相关话语不能被简单概括为接受或拒绝，而应从AI能力、医生角色、风险认知和人机关系的组合加以理解。对医疗机构而言，过半积极评价支持继续提供低风险辅助，但不支持取消医生把关；风险责任型话语则要求把问责接口写进服务流程，而不是据此撤回全部应用。</w:t>
+        <w:t>本文基于多平台社交媒体评论，构建了由态度效价、认知主题、词语共现结构到认知配置的分析链条。模型识别结果显示，积极评论占相关评论的52.4%，占有态度评论的75.6%；上述比例仅反映评论态度分布，不代表人群比例。进一步分析发现，积极态度内部呈现技术崇拜、务实认可和人机协同等不同配置，中立态度主要体现人机协同，消极态度则表现为技术恐惧和风险责任两类配置。五种模式以词簇为分析单位，其包含的词簇数量不能用于推断相应评论或人群比例。研究表明，公众对生成式人工智能医疗应用的认知不能被简单概括为接受或拒绝，而应从AI能力、医生角色、风险认知和人机关系的组合加以理解。对医疗机构而言，积极评价不能作为取消医生把关或授权AI独立诊断的依据；风险责任型话语也不意味着应当撤回全部辅助应用，而是提示机构将复核、问责和救济机制纳入服务流程。</w:t>
       </w:r>
     </w:p>
     <w:p>
@@ -17143,7 +17143,7 @@
           <w:sz w:val="18"/>
           <w:szCs w:val="18"/>
         </w:rPr>
-        <w:t>[2]　Bracic A, Spector-Bagdady K, Towle S, et al. Factors for patient trust and acceptance of medical artificial intelligence[J]. JAMA Network Open, 2026. DOI: 10.1001/jamanetworkopen.2026.0815.</w:t>
+        <w:t>[2]　Bracic A, Spector-Bagdady K, Towle S, et al. Factors for patient trust and acceptance of medical artificial intelligence[J]. JAMA Network Open, 2026, 9(3): e260815. DOI: 10.1001/jamanetworkopen.2026.0815.</w:t>
       </w:r>
     </w:p>
     <w:p>

</xml_diff>

<commit_message>
Polish remaining academic wording
Co-authored-by: C20-end <C20-end@users.noreply.github.com>
</commit_message>
<xml_diff>
--- a/生成式人工智能医疗服务中的公众认知配置与人机治理——一项基于社交媒体文本挖掘的分析.docx
+++ b/生成式人工智能医疗服务中的公众认知配置与人机治理——一项基于社交媒体文本挖掘的分析.docx
@@ -16354,7 +16354,7 @@
           <w:sz w:val="21"/>
           <w:szCs w:val="21"/>
         </w:rPr>
-        <w:t>消极态度内部同样包含不同解释机制。技术恐惧型以“不行”“不敢”“瞎编”“无法取代”等表达为主，其话语特征与见到错误后回避算法的倾向较为一致〔30〕，既包括对系统能力的怀疑，也包括对医生职业被替代的担忧。Gaube等指出，对AI建议的口头贬损并不必然对应行为上的完全拒斥〔14〕，因而技术恐惧型话语中的能力怀疑与替代焦虑，也不宜直接等同于拒绝一切辅助使用。风险责任型则不必然否定技术的辅助价值，其核心在于追问发生误诊后由谁承担责任、由谁复核以及如何获得救济。在“误诊了算谁的？AI能负责吗？”等评论中，医生角色被强化主要源于对责任主体和复核机制的要求。这与调查中公众普遍要求获知诊疗是否使用AI的发现相一致〔10〕；Cavalier等亦显示，即使内容评价可能偏向AI起草文本，标明AI来源仍会改变满意度〔20〕。由此可见，一般技术排斥与制度性问责不宜混为一谈。</w:t>
+        <w:t>消极态度内部同样包含不同解释机制。技术恐惧型以“不行”“不敢”“瞎编”“无法取代”等表达为主，其话语特征与观察到算法错误后降低依赖的倾向较为一致〔30〕，既包括对系统能力的怀疑，也包括对医生职业被替代的担忧。Gaube等发现，表达层面的负面评价并不必然转化为行为层面的完全拒绝〔14〕，因而不能将技术恐惧型话语中的能力怀疑与替代焦虑直接解释为拒绝一切辅助应用。风险责任型则不必然否定技术的辅助价值，其核心在于追问发生误诊后由谁承担责任、由谁复核以及如何获得救济。“误诊了算谁的？AI能负责吗？”等评论对医生角色的强调，主要源于对责任主体和复核机制的要求。这与调查中公众普遍要求获知诊疗是否使用AI的发现相一致〔10〕；Cavalier等亦显示，即使AI起草文本可能获得较高的内容评价，披露AI来源仍会改变满意度〔20〕。因此，一般性技术排斥与制度性问责应当区分讨论。</w:t>
       </w:r>
     </w:p>
     <w:p>
@@ -16730,7 +16730,7 @@
                 <w:sz w:val="18"/>
                 <w:szCs w:val="18"/>
               </w:rPr>
-              <w:t>将低风险信息服务与诊断决策分层提供，避免同一套智能问诊包装</w:t>
+              <w:t>将低风险信息服务与诊断决策分层提供，避免使用统一的“智能问诊”标签模糊不同功能边界</w:t>
             </w:r>
           </w:p>
         </w:tc>
@@ -16908,7 +16908,7 @@
                 <w:sz w:val="18"/>
                 <w:szCs w:val="18"/>
               </w:rPr>
-              <w:t>按具体任务说明系统能做与不能做的，而不是笼统宣传技术安全</w:t>
+              <w:t>依据具体任务说明系统的适用范围与能力边界，避免笼统宣传技术安全</w:t>
             </w:r>
           </w:p>
         </w:tc>

</xml_diff>